<commit_message>
Art prompts: the new runes of magic (elements and categories)
Co-Authored-By: Claude Opus 5.5 <noreply@anthropic.com>
Claude-Session: https://claude.ai/code/session_01YCWNLtj9zFsogxZeNiDKcG
</commit_message>
<xml_diff>
--- a/docs/Промпты-арт.docx
+++ b/docs/Промпты-арт.docx
@@ -693,6 +693,336 @@
         <w:t>Ползунок: A narrow vertical scrollbar thumb for a game interface, flat front view, transparent background: a slender rounded bar of antique gold with a dark ink outline, like a quill's shaft, the ends rounded and slightly pointed, each with a tiny violet crystal stud, all of it kept within the outer quarter of the height; the middle half plain and even so they can be stretched. [приписка стиля]</w:t>
       </w:r>
     </w:p>
+    <w:p>
+      <w:pPr>
+        <w:pStyle w:val="Heading2"/>
+      </w:pPr>
+      <w:r>
+        <w:t>Магия: новые руны (элементы и категории)</w:t>
+      </w:r>
+    </w:p>
+    <w:p>
+      <w:r>
+        <w:t xml:space="preserve">Файлы: </w:t>
+      </w:r>
+      <w:r>
+        <w:rPr>
+          <w:rFonts w:ascii="Consolas" w:hAnsi="Consolas"/>
+        </w:rPr>
+        <w:t>Textures/UI/Ritualistics/Runes/Ink/Rune_&lt;Имя&gt;.png</w:t>
+      </w:r>
+      <w:r>
+        <w:t>, 512×512, прозрачный фон. Светящийся вариант (Glow) я делаю сама из чернильного. Руны общие для ритуалистики и магии.</w:t>
+      </w:r>
+    </w:p>
+    <w:p>
+      <w:r>
+        <w:t>Общая приписка (в конец каждого промпта):</w:t>
+      </w:r>
+    </w:p>
+    <w:p>
+      <w:pPr>
+        <w:pStyle w:val="IntenseQuote"/>
+      </w:pPr>
+      <w:r>
+        <w:t>A single rune glyph for a game interface, centered, flat front view, on a pure white background: drawn in solid black ink with tapered calligraphic brush strokes - each stroke thick in the middle and sharpening to fine needle points at both ends, with a small diamond node where strokes meet; clean, bold, readable at small size, roughly symmetrical, fitting the same family as an eight-ray star of needle strokes; no circle frame, no text, no letters, no shading, no color. 512×512.</w:t>
+      </w:r>
+    </w:p>
+    <w:p>
+      <w:r>
+        <w:t xml:space="preserve">Категории, у которых уже есть руна ритуалистики, берут её: </w:t>
+      </w:r>
+      <w:r>
+        <w:rPr>
+          <w:b/>
+        </w:rPr>
+        <w:t>Пульс</w:t>
+      </w:r>
+      <w:r>
+        <w:t xml:space="preserve"> = Release, </w:t>
+      </w:r>
+      <w:r>
+        <w:rPr>
+          <w:b/>
+        </w:rPr>
+        <w:t>Оковы</w:t>
+      </w:r>
+      <w:r>
+        <w:t xml:space="preserve"> = Hold, </w:t>
+      </w:r>
+      <w:r>
+        <w:rPr>
+          <w:b/>
+        </w:rPr>
+        <w:t>Иссушение</w:t>
+      </w:r>
+      <w:r>
+        <w:t xml:space="preserve"> = Drain, </w:t>
+      </w:r>
+      <w:r>
+        <w:rPr>
+          <w:b/>
+        </w:rPr>
+        <w:t>Оберег</w:t>
+      </w:r>
+      <w:r>
+        <w:t xml:space="preserve"> = Barrier.</w:t>
+      </w:r>
+    </w:p>
+    <w:p>
+      <w:pPr>
+        <w:pStyle w:val="Heading3"/>
+      </w:pPr>
+      <w:r>
+        <w:t>Руны элементов</w:t>
+      </w:r>
+    </w:p>
+    <w:p>
+      <w:pPr>
+        <w:pStyle w:val="ListBullet"/>
+      </w:pPr>
+      <w:r>
+        <w:rPr>
+          <w:b/>
+        </w:rPr>
+        <w:t>Rune_Fire</w:t>
+      </w:r>
+      <w:r>
+        <w:t xml:space="preserve"> (Огонь): &gt; Rune of fire: three tapered needle strokes rising and curling inward like a single flame tongue, the central stroke tallest, a small diamond node at the base. [приписка]</w:t>
+      </w:r>
+    </w:p>
+    <w:p>
+      <w:pPr>
+        <w:pStyle w:val="ListBullet"/>
+      </w:pPr>
+      <w:r>
+        <w:rPr>
+          <w:b/>
+        </w:rPr>
+        <w:t>Rune_Water</w:t>
+      </w:r>
+      <w:r>
+        <w:t xml:space="preserve"> (Вода): &gt; Rune of water: two long tapered strokes bending into a gentle S-wave, a third shorter wave beneath echoing it, a small diamond node like a falling drop above. [приписка]</w:t>
+      </w:r>
+    </w:p>
+    <w:p>
+      <w:pPr>
+        <w:pStyle w:val="ListBullet"/>
+      </w:pPr>
+      <w:r>
+        <w:rPr>
+          <w:b/>
+        </w:rPr>
+        <w:t>Rune_Earth</w:t>
+      </w:r>
+      <w:r>
+        <w:t xml:space="preserve"> (Земля): &gt; Rune of earth: a heavy horizontal tapered stroke with two short strokes rising from it like a mountain's slopes meeting at a diamond peak, a short root stroke going down from the middle. [приписка]</w:t>
+      </w:r>
+    </w:p>
+    <w:p>
+      <w:pPr>
+        <w:pStyle w:val="ListBullet"/>
+      </w:pPr>
+      <w:r>
+        <w:rPr>
+          <w:b/>
+        </w:rPr>
+        <w:t>Rune_Air</w:t>
+      </w:r>
+      <w:r>
+        <w:t xml:space="preserve"> (Воздух): &gt; Rune of air: three thin tapered strokes sweeping in one direction like gusts, each curling at its end into a small open hook, staggered one above another. [приписка]</w:t>
+      </w:r>
+    </w:p>
+    <w:p>
+      <w:pPr>
+        <w:pStyle w:val="ListBullet"/>
+      </w:pPr>
+      <w:r>
+        <w:rPr>
+          <w:b/>
+        </w:rPr>
+        <w:t>Rune_Light</w:t>
+      </w:r>
+      <w:r>
+        <w:t xml:space="preserve"> (Свет): &gt; Rune of light: a vertical needle stroke crossed by a shorter horizontal one, with four tiny strokes radiating diagonally from a diamond centre, like a four-point star with faint rays. [приписка]</w:t>
+      </w:r>
+    </w:p>
+    <w:p>
+      <w:pPr>
+        <w:pStyle w:val="ListBullet"/>
+      </w:pPr>
+      <w:r>
+        <w:rPr>
+          <w:b/>
+        </w:rPr>
+        <w:t>Rune_Time</w:t>
+      </w:r>
+      <w:r>
+        <w:t xml:space="preserve"> (Время): &gt; Rune of time: two tapered strokes forming an hourglass - two triangles meeting at a diamond node in the middle, a thin arc stroke curving around one side like the edge of a turning wheel. [приписка]</w:t>
+      </w:r>
+    </w:p>
+    <w:p>
+      <w:pPr>
+        <w:pStyle w:val="ListBullet"/>
+      </w:pPr>
+      <w:r>
+        <w:rPr>
+          <w:b/>
+        </w:rPr>
+        <w:t>Rune_Life</w:t>
+      </w:r>
+      <w:r>
+        <w:t xml:space="preserve"> (Жизнь): &gt; Rune of life: a vertical tapered stroke like a stem, two leaf-shaped strokes opening from it to either side, and a thin stroke flowing from one leaf back to the base, closing a cycle. [приписка]</w:t>
+      </w:r>
+    </w:p>
+    <w:p>
+      <w:pPr>
+        <w:pStyle w:val="ListBullet"/>
+      </w:pPr>
+      <w:r>
+        <w:rPr>
+          <w:b/>
+        </w:rPr>
+        <w:t>Rune_Darkness</w:t>
+      </w:r>
+      <w:r>
+        <w:t xml:space="preserve"> (Тьма): &gt; Rune of darkness: a thick crescent stroke curving around an empty centre, its two points nearly touching, a single small diamond node hidden inside the crescent like an eye half-closed. [приписка]</w:t>
+      </w:r>
+    </w:p>
+    <w:p>
+      <w:pPr>
+        <w:pStyle w:val="ListBullet"/>
+      </w:pPr>
+      <w:r>
+        <w:rPr>
+          <w:b/>
+        </w:rPr>
+        <w:t>Rune_Space</w:t>
+      </w:r>
+      <w:r>
+        <w:t xml:space="preserve"> (Пространство, малая школа телекинеза): &gt; Rune of space: a diamond node in the centre with four thin tapered strokes reaching out to four smaller diamond nodes, as if pulled by invisible threads, one thread slightly bent. [приписка]</w:t>
+      </w:r>
+    </w:p>
+    <w:p>
+      <w:pPr>
+        <w:pStyle w:val="Heading3"/>
+      </w:pPr>
+      <w:r>
+        <w:t>Руны категорий</w:t>
+      </w:r>
+    </w:p>
+    <w:p>
+      <w:pPr>
+        <w:pStyle w:val="ListBullet"/>
+      </w:pPr>
+      <w:r>
+        <w:rPr>
+          <w:b/>
+        </w:rPr>
+        <w:t>Rune_Aura</w:t>
+      </w:r>
+      <w:r>
+        <w:t xml:space="preserve"> (Аура): &gt; Rune of aura: a small diamond node at the centre inside two broken concentric arcs of tapered strokes, the gaps of the arcs offset from each other. [приписка]</w:t>
+      </w:r>
+    </w:p>
+    <w:p>
+      <w:pPr>
+        <w:pStyle w:val="ListBullet"/>
+      </w:pPr>
+      <w:r>
+        <w:rPr>
+          <w:b/>
+        </w:rPr>
+        <w:t>Rune_Enchant</w:t>
+      </w:r>
+      <w:r>
+        <w:t xml:space="preserve"> (Наделение): &gt; Rune of enchanting: a tapered blade-like vertical stroke with a short crossguard stroke, and a thin spiral stroke winding once around the blade from hilt to point. [приписка]</w:t>
+      </w:r>
+    </w:p>
+    <w:p>
+      <w:pPr>
+        <w:pStyle w:val="ListBullet"/>
+      </w:pPr>
+      <w:r>
+        <w:rPr>
+          <w:b/>
+        </w:rPr>
+        <w:t>Rune_Step</w:t>
+      </w:r>
+      <w:r>
+        <w:t xml:space="preserve"> (Шаг): &gt; Rune of stepping: two diamond nodes far apart joined by a single long tapered stroke that arcs between them like a leap, with a small chevron stroke at the landing end. [приписка]</w:t>
+      </w:r>
+    </w:p>
+    <w:p>
+      <w:pPr>
+        <w:pStyle w:val="ListBullet"/>
+      </w:pPr>
+      <w:r>
+        <w:rPr>
+          <w:b/>
+        </w:rPr>
+        <w:t>Rune_Restore</w:t>
+      </w:r>
+      <w:r>
+        <w:t xml:space="preserve"> (Восстановление): &gt; Rune of restoring: a nearly closed circular tapered stroke with its ends overlapping, a short stroke inside pointing back against the direction of the circle, like time turned back on a wound. [приписка]</w:t>
+      </w:r>
+    </w:p>
+    <w:p>
+      <w:pPr>
+        <w:pStyle w:val="ListBullet"/>
+      </w:pPr>
+      <w:r>
+        <w:rPr>
+          <w:b/>
+        </w:rPr>
+        <w:t>Rune_Beam</w:t>
+      </w:r>
+      <w:r>
+        <w:t xml:space="preserve"> (Луч): &gt; Rune of a beam: one long straight horizontal needle stroke issuing from a diamond node at the left, two thin parallel strokes running alongside it and fading out before its point. [приписка]</w:t>
+      </w:r>
+    </w:p>
+    <w:p>
+      <w:pPr>
+        <w:pStyle w:val="ListBullet"/>
+      </w:pPr>
+      <w:r>
+        <w:rPr>
+          <w:b/>
+        </w:rPr>
+        <w:t>Rune_Shape</w:t>
+      </w:r>
+      <w:r>
+        <w:t xml:space="preserve"> (Ваяние): &gt; Rune of shaping: a square of four tapered strokes with one corner pulled out and bent into a curve, as if the form is being reshaped, a diamond node at the bent corner. [приписка]</w:t>
+      </w:r>
+    </w:p>
+    <w:p>
+      <w:pPr>
+        <w:pStyle w:val="ListBullet"/>
+      </w:pPr>
+      <w:r>
+        <w:rPr>
+          <w:b/>
+        </w:rPr>
+        <w:t>Rune_Summon</w:t>
+      </w:r>
+      <w:r>
+        <w:t xml:space="preserve"> (Призыв): &gt; Rune of summoning: an open downward arch of tapered strokes like a doorway, a diamond node rising from below through its opening, three tiny strokes above it like a calling. [приписка]</w:t>
+      </w:r>
+    </w:p>
+    <w:p>
+      <w:pPr>
+        <w:pStyle w:val="ListBullet"/>
+      </w:pPr>
+      <w:r>
+        <w:rPr>
+          <w:b/>
+        </w:rPr>
+        <w:t>Rune_Sense</w:t>
+      </w:r>
+      <w:r>
+        <w:t xml:space="preserve"> (Чутьё): &gt; Rune of sensing: an almond eye shape of two tapered curved strokes, its pupil a diamond node, with three short strokes spreading forward from the eye like a seeing gaze. [приписка]</w:t>
+      </w:r>
+    </w:p>
     <w:sectPr>
       <w:pgSz w:w="12240" w:h="15840"/>
       <w:pgMar w:top="1440" w:right="1800" w:bottom="1440" w:left="1800" w:header="720" w:footer="720" w:gutter="0"/>
@@ -1066,10 +1396,6 @@
     <w:name w:val="Normal"/>
     <w:qFormat/>
     <w:rsid w:val="00FC693F"/>
-    <w:rPr>
-      <w:rFonts w:ascii="Calibri" w:hAnsi="Calibri"/>
-      <w:sz w:val="22"/>
-    </w:rPr>
   </w:style>
   <w:style w:type="paragraph" w:styleId="Header">
     <w:name w:val="header"/>

</xml_diff>

<commit_message>
Magic: one switch for the whole system (off by default); plan: woven circles for elite mages; one prompt for the rune sheet with a reference
Co-Authored-By: Claude Opus 5.5 <noreply@anthropic.com>
Claude-Session: https://claude.ai/code/session_01YCWNLtj9zFsogxZeNiDKcG
</commit_message>
<xml_diff>
--- a/docs/Промпты-арт.docx
+++ b/docs/Промпты-арт.docx
@@ -1023,6 +1023,237 @@
         <w:t xml:space="preserve"> (Чутьё): &gt; Rune of sensing: an almond eye shape of two tapered curved strokes, its pupil a diamond node, with three short strokes spreading forward from the eye like a seeing gaze. [приписка]</w:t>
       </w:r>
     </w:p>
+    <w:p>
+      <w:pPr>
+        <w:pStyle w:val="Heading3"/>
+      </w:pPr>
+      <w:r>
+        <w:t>Единый промпт для набора (ChatGPT) + референс</w:t>
+      </w:r>
+    </w:p>
+    <w:p>
+      <w:r>
+        <w:t xml:space="preserve">Референс: </w:t>
+      </w:r>
+      <w:r>
+        <w:rPr>
+          <w:rFonts w:ascii="Consolas" w:hAnsi="Consolas"/>
+        </w:rPr>
+        <w:t>docs/Руны-референс.png</w:t>
+      </w:r>
+      <w:r>
+        <w:t xml:space="preserve"> (12 нынешних рун). Приложить его к запросу. Потом я сама разрежу лист на отдельные руны.</w:t>
+      </w:r>
+    </w:p>
+    <w:p>
+      <w:pPr>
+        <w:pStyle w:val="IntenseQuote"/>
+      </w:pPr>
+      <w:r>
+        <w:t>Using the attached reference sheet as the exact style guide, draw a new sheet of 17 rune glyphs in the same family. Style, matching the reference: solid black ink on a pure white background; thorny, barbed calligraphic brush strokes - each stroke thick in its middle, sharpening to needle points at both ends, with small spikes along its length like briar; small diamond nodes where strokes meet; bold, clean and readable at small size; no circle frames, no text, no letters, no shading, no colour. Lay them out as a grid of 5 columns and 4 rows, each glyph centred in its own equal cell with generous white space around it, nothing touching the edges of the cell, the last row with 2 glyphs.</w:t>
+      </w:r>
+    </w:p>
+    <w:p>
+      <w:pPr>
+        <w:pStyle w:val="IntenseQuote"/>
+      </w:pPr>
+    </w:p>
+    <w:p>
+      <w:pPr>
+        <w:pStyle w:val="IntenseQuote"/>
+      </w:pPr>
+      <w:r>
+        <w:t>Row 1 - the elements:</w:t>
+      </w:r>
+    </w:p>
+    <w:p>
+      <w:pPr>
+        <w:pStyle w:val="IntenseQuote"/>
+      </w:pPr>
+      <w:r>
+        <w:t>1. Fire: three thorny strokes rising and curling inward like a single flame tongue, the middle one tallest, a diamond node at the base.</w:t>
+      </w:r>
+    </w:p>
+    <w:p>
+      <w:pPr>
+        <w:pStyle w:val="IntenseQuote"/>
+      </w:pPr>
+      <w:r>
+        <w:t>2. Water: two long strokes bending into a gentle S-wave, a shorter wave beneath echoing it, a diamond node above like a falling drop.</w:t>
+      </w:r>
+    </w:p>
+    <w:p>
+      <w:pPr>
+        <w:pStyle w:val="IntenseQuote"/>
+      </w:pPr>
+      <w:r>
+        <w:t>3. Earth: a heavy horizontal stroke with two short strokes rising from it to meet at a diamond peak like a mountain, a short root stroke going down from the middle.</w:t>
+      </w:r>
+    </w:p>
+    <w:p>
+      <w:pPr>
+        <w:pStyle w:val="IntenseQuote"/>
+      </w:pPr>
+      <w:r>
+        <w:t>4. Air: three thin strokes sweeping one way like gusts, each curling at its end into an open hook, staggered one above another.</w:t>
+      </w:r>
+    </w:p>
+    <w:p>
+      <w:pPr>
+        <w:pStyle w:val="IntenseQuote"/>
+      </w:pPr>
+      <w:r>
+        <w:t>5. Light: a vertical needle stroke crossed by a shorter horizontal one, four tiny rays between them from a diamond centre - a four-point star.</w:t>
+      </w:r>
+    </w:p>
+    <w:p>
+      <w:pPr>
+        <w:pStyle w:val="IntenseQuote"/>
+      </w:pPr>
+    </w:p>
+    <w:p>
+      <w:pPr>
+        <w:pStyle w:val="IntenseQuote"/>
+      </w:pPr>
+      <w:r>
+        <w:t>Row 2 - the elements, continued:</w:t>
+      </w:r>
+    </w:p>
+    <w:p>
+      <w:pPr>
+        <w:pStyle w:val="IntenseQuote"/>
+      </w:pPr>
+      <w:r>
+        <w:t>6. Time: two strokes forming an hourglass - two triangles meeting at a diamond node in the middle - with a thin arc curving around one side like the rim of a turning wheel.</w:t>
+      </w:r>
+    </w:p>
+    <w:p>
+      <w:pPr>
+        <w:pStyle w:val="IntenseQuote"/>
+      </w:pPr>
+      <w:r>
+        <w:t>7. Life: a vertical stem stroke, two leaf-shaped strokes opening from it to either side, a thin stroke flowing from one leaf back down to the base, closing a cycle.</w:t>
+      </w:r>
+    </w:p>
+    <w:p>
+      <w:pPr>
+        <w:pStyle w:val="IntenseQuote"/>
+      </w:pPr>
+      <w:r>
+        <w:t>8. Darkness: a thick crescent stroke curving around an empty centre, its points nearly touching, a single small diamond node inside like a half-closed eye.</w:t>
+      </w:r>
+    </w:p>
+    <w:p>
+      <w:pPr>
+        <w:pStyle w:val="IntenseQuote"/>
+      </w:pPr>
+      <w:r>
+        <w:t>9. Space: a diamond node in the centre with four thin strokes reaching out to four smaller diamond nodes, as if pulled on threads, one thread slightly bent.</w:t>
+      </w:r>
+    </w:p>
+    <w:p>
+      <w:pPr>
+        <w:pStyle w:val="IntenseQuote"/>
+      </w:pPr>
+      <w:r>
+        <w:t>10. Aura: a small diamond node at the centre inside two broken concentric arcs, the gaps of the arcs offset from each other.</w:t>
+      </w:r>
+    </w:p>
+    <w:p>
+      <w:pPr>
+        <w:pStyle w:val="IntenseQuote"/>
+      </w:pPr>
+    </w:p>
+    <w:p>
+      <w:pPr>
+        <w:pStyle w:val="IntenseQuote"/>
+      </w:pPr>
+      <w:r>
+        <w:t>Row 3 - the forms of a spell:</w:t>
+      </w:r>
+    </w:p>
+    <w:p>
+      <w:pPr>
+        <w:pStyle w:val="IntenseQuote"/>
+      </w:pPr>
+      <w:r>
+        <w:t>11. Enchanting: a blade-like vertical stroke with a short crossguard, a thin spiral stroke winding once around the blade from hilt to point.</w:t>
+      </w:r>
+    </w:p>
+    <w:p>
+      <w:pPr>
+        <w:pStyle w:val="IntenseQuote"/>
+      </w:pPr>
+      <w:r>
+        <w:t>12. Step: two diamond nodes far apart joined by one long stroke that arcs between them like a leap, a small chevron at the landing end.</w:t>
+      </w:r>
+    </w:p>
+    <w:p>
+      <w:pPr>
+        <w:pStyle w:val="IntenseQuote"/>
+      </w:pPr>
+      <w:r>
+        <w:t>13. Restoring: a nearly closed circular stroke with its ends overlapping, a short stroke inside pointing back against the direction of the circle.</w:t>
+      </w:r>
+    </w:p>
+    <w:p>
+      <w:pPr>
+        <w:pStyle w:val="IntenseQuote"/>
+      </w:pPr>
+      <w:r>
+        <w:t>14. Beam: one long straight horizontal needle stroke issuing from a diamond node on the left, two thin parallel strokes running beside it and fading out before its point.</w:t>
+      </w:r>
+    </w:p>
+    <w:p>
+      <w:pPr>
+        <w:pStyle w:val="IntenseQuote"/>
+      </w:pPr>
+      <w:r>
+        <w:t>15. Shaping: a square of four strokes with one corner pulled out and bent into a curve, a diamond node at the bent corner.</w:t>
+      </w:r>
+    </w:p>
+    <w:p>
+      <w:pPr>
+        <w:pStyle w:val="IntenseQuote"/>
+      </w:pPr>
+    </w:p>
+    <w:p>
+      <w:pPr>
+        <w:pStyle w:val="IntenseQuote"/>
+      </w:pPr>
+      <w:r>
+        <w:t>Row 4 - the forms, continued:</w:t>
+      </w:r>
+    </w:p>
+    <w:p>
+      <w:pPr>
+        <w:pStyle w:val="IntenseQuote"/>
+      </w:pPr>
+      <w:r>
+        <w:t>16. Summoning: an open downward arch like a doorway, a diamond node rising from below through its opening, three tiny strokes above it like a call.</w:t>
+      </w:r>
+    </w:p>
+    <w:p>
+      <w:pPr>
+        <w:pStyle w:val="IntenseQuote"/>
+      </w:pPr>
+      <w:r>
+        <w:t>17. Sensing: an almond eye of two curved strokes, its pupil a diamond node, three short strokes spreading forward from the eye like a gaze.</w:t>
+      </w:r>
+    </w:p>
+    <w:p>
+      <w:pPr>
+        <w:pStyle w:val="IntenseQuote"/>
+      </w:pPr>
+    </w:p>
+    <w:p>
+      <w:pPr>
+        <w:pStyle w:val="IntenseQuote"/>
+      </w:pPr>
+      <w:r>
+        <w:t>Each glyph must be clearly different in silhouette from all the others and from the reference runes.</w:t>
+      </w:r>
+    </w:p>
     <w:sectPr>
       <w:pgSz w:w="12240" w:h="15840"/>
       <w:pgMar w:top="1440" w:right="1800" w:bottom="1440" w:left="1800" w:header="720" w:footer="720" w:gutter="0"/>

</xml_diff>

<commit_message>
Magic3: the seventeen runes in ritualistics and the codex, rituals coloured by their elements, Arlie's plaque in the codex, the Arcana plaque art hook, antlers; prompts for the plaques and the sanctuary
Co-Authored-By: Claude Opus 5.5 <noreply@anthropic.com>
Claude-Session: https://claude.ai/code/session_01YCWNLtj9zFsogxZeNiDKcG
</commit_message>
<xml_diff>
--- a/docs/Промпты-арт.docx
+++ b/docs/Промпты-арт.docx
@@ -1254,6 +1254,145 @@
         <w:t>Each glyph must be clearly different in silhouette from all the others and from the reference runes.</w:t>
       </w:r>
     </w:p>
+    <w:p>
+      <w:pPr>
+        <w:pStyle w:val="Heading2"/>
+      </w:pPr>
+      <w:r>
+        <w:t>Магия: шкала Арканы (маг и чародей)</w:t>
+      </w:r>
+    </w:p>
+    <w:p>
+      <w:r>
+        <w:t xml:space="preserve">Файлы: </w:t>
+      </w:r>
+      <w:r>
+        <w:rPr>
+          <w:rFonts w:ascii="Consolas" w:hAnsi="Consolas"/>
+        </w:rPr>
+        <w:t>Textures/UI/Magic/ArcanaMage.png</w:t>
+      </w:r>
+      <w:r>
+        <w:t xml:space="preserve"> и </w:t>
+      </w:r>
+      <w:r>
+        <w:rPr>
+          <w:rFonts w:ascii="Consolas" w:hAnsi="Consolas"/>
+        </w:rPr>
+        <w:t>Textures/UI/Magic/ArcanaSorcerer.png</w:t>
+      </w:r>
+      <w:r>
+        <w:t xml:space="preserve">, по 1024×362 (пропорция 136×48). Это рамка с </w:t>
+      </w:r>
+      <w:r>
+        <w:rPr>
+          <w:b/>
+        </w:rPr>
+        <w:t>прозрачным окном</w:t>
+      </w:r>
+      <w:r>
+        <w:t xml:space="preserve"> под полосу: окно — от 12% до 88% по ширине и от 46% до 82% по высоте. Полосу, метки и число рисует игра, в верхней части рамки над окном пишется число.</w:t>
+      </w:r>
+    </w:p>
+    <w:p>
+      <w:pPr>
+        <w:pStyle w:val="IntenseQuote"/>
+      </w:pPr>
+      <w:r>
+        <w:t>Two small horizontal gauge plaques for a game interface, side by side on one sheet, flat front view, transparent background, each 1024×362: a frame of dark worked silver with a long narrow window cut through its lower half - the window fully transparent, spanning from 12% to 88% of the width and from 46% to 82% of the height, its edges clean and straight; above the window a quiet strip of dark lacquer for a small number. Left plaque, the mage's: cold steel-blue enamel inlays along the frame, a small sapphire set at each end of the window, thin lines like the ruled margins of a spellbook. Right plaque, the sorcerer's: warm antique gold, the frame grown with fine flame-like filigree as if it were born that way, a small amber stone at each end of the window. Both: Avir-adjacent ritualist style - worked metal, small four-point stars, a crescent at most; clean game UI art, a thin dark outline, no text, no letters, no numbers.</w:t>
+      </w:r>
+    </w:p>
+    <w:p>
+      <w:pPr>
+        <w:pStyle w:val="Heading2"/>
+      </w:pPr>
+      <w:r>
+        <w:t>Магия: святилище</w:t>
+      </w:r>
+    </w:p>
+    <w:p>
+      <w:r>
+        <w:t>Святилище — постройка, которую ставят в центр ритуального круга: каменная платформа-круг в земле, на которой нарисован ритуал. Размер — средний круг (5×5 клеток). Неокрашиваемая. На центральном месте игра сама рисует руну главного элемента. Отдельно — эффект энергии, который игра перекрашивает под элемент.</w:t>
+      </w:r>
+    </w:p>
+    <w:p>
+      <w:pPr>
+        <w:pStyle w:val="Heading3"/>
+      </w:pPr>
+      <w:r>
+        <w:t>Платформа, три ракурса (одним листом)</w:t>
+      </w:r>
+    </w:p>
+    <w:p>
+      <w:r>
+        <w:t xml:space="preserve">Файлы: </w:t>
+      </w:r>
+      <w:r>
+        <w:rPr>
+          <w:rFonts w:ascii="Consolas" w:hAnsi="Consolas"/>
+        </w:rPr>
+        <w:t>Textures/Things/Building/Magic/Sanctuary_north.png</w:t>
+      </w:r>
+      <w:r>
+        <w:t xml:space="preserve">, </w:t>
+      </w:r>
+      <w:r>
+        <w:rPr>
+          <w:rFonts w:ascii="Consolas" w:hAnsi="Consolas"/>
+        </w:rPr>
+        <w:t>_east.png</w:t>
+      </w:r>
+      <w:r>
+        <w:t xml:space="preserve">, </w:t>
+      </w:r>
+      <w:r>
+        <w:rPr>
+          <w:rFonts w:ascii="Consolas" w:hAnsi="Consolas"/>
+        </w:rPr>
+        <w:t>_south.png</w:t>
+      </w:r>
+      <w:r>
+        <w:t>, каждый 1024×1024.</w:t>
+      </w:r>
+    </w:p>
+    <w:p>
+      <w:pPr>
+        <w:pStyle w:val="IntenseQuote"/>
+      </w:pPr>
+      <w:r>
+        <w:t>A game asset sheet showing the same building from three views side by side - north, east and south - each on its own transparent square, RimWorld top-down art style (viewed from above at a slight angle, crisp painted shapes, a thin dark outline): a round sanctuary platform of old grey carved stone set flush into the ground, five cells wide; a broad flat ring of worn flagstones with a low raised rim, the rim carved with a band of small four-point stars, crescents and short feather strokes; three thin concentric grooves cut into the floor like the rings of a ritual circle, left empty and clean so a ritual can be drawn into them; at the centre a smooth round stone dais with an empty round socket where a rune will be laid; four small standing stones at the cardinal points of the rim, each with a hollow for a crystal. Plain grey stone only - no colour, no glow, no paint, no runes, no text; the floor between the grooves calm and empty. Each view centred and filling its square.</w:t>
+      </w:r>
+    </w:p>
+    <w:p>
+      <w:pPr>
+        <w:pStyle w:val="Heading3"/>
+      </w:pPr>
+      <w:r>
+        <w:t>Эффект энергии (перекрашивается под элемент)</w:t>
+      </w:r>
+    </w:p>
+    <w:p>
+      <w:r>
+        <w:t xml:space="preserve">Файл: </w:t>
+      </w:r>
+      <w:r>
+        <w:rPr>
+          <w:rFonts w:ascii="Consolas" w:hAnsi="Consolas"/>
+        </w:rPr>
+        <w:t>Textures/Things/Building/Magic/SanctuaryFlow.png</w:t>
+      </w:r>
+      <w:r>
+        <w:t>, 1024×1024. Игра вращает его, пульсирует яркостью и окрашивает в цвет элемента.</w:t>
+      </w:r>
+    </w:p>
+    <w:p>
+      <w:pPr>
+        <w:pStyle w:val="IntenseQuote"/>
+      </w:pPr>
+      <w:r>
+        <w:t>A single top-down game effect texture on a pure black background, meant to be drawn additively and tinted in code: a slow vortex of pale white-grey energy gathering towards the centre of a circle - thin luminous streams spiralling inwards from the rim, small motes and sparks drifting along them, faint concentric rings of light where the streams cross the circle's grooves, the brightest glow gathered at the very centre; soft edges, no hard shapes, no colour - only white and greys - so it can be recoloured; seamless round falloff to pure black at the edges. 1024×1024.</w:t>
+      </w:r>
+    </w:p>
     <w:sectPr>
       <w:pgSz w:w="12240" w:h="15840"/>
       <w:pgMar w:top="1440" w:right="1800" w:bottom="1440" w:left="1800" w:header="720" w:footer="720" w:gutter="0"/>

</xml_diff>

<commit_message>
Magic5: the Magic panel (the third of the mod's panels), Arcana gizmo at full size, the core coloured for mage and sorcerer, a passing codex remark kept short and apart
Co-Authored-By: Claude Opus 5.5 <noreply@anthropic.com>
Claude-Session: https://claude.ai/code/session_01YCWNLtj9zFsogxZeNiDKcG
</commit_message>
<xml_diff>
--- a/docs/Промпты-арт.docx
+++ b/docs/Промпты-арт.docx
@@ -77,16 +77,7 @@
     </w:p>
     <w:p>
       <w:r>
-        <w:t xml:space="preserve">Файл: </w:t>
-      </w:r>
-      <w:r>
-        <w:rPr>
-          <w:rFonts w:ascii="Consolas" w:hAnsi="Consolas"/>
-        </w:rPr>
-        <w:t>Textures/Things/Building/Production/OmniCrafter2_l.png</w:t>
-      </w:r>
-      <w:r>
-        <w:t xml:space="preserve"> (та же текстура у узорного ткача 3×3 — после арта разведу на два файла)</w:t>
+        <w:t>Файл: `Textures/Things/Building/Production/OmniCrafter2_l.png` (та же текстура у узорного ткача 3×3 — после арта разведу на два файла)</w:t>
       </w:r>
     </w:p>
     <w:p>
@@ -107,16 +98,7 @@
     </w:p>
     <w:p>
       <w:r>
-        <w:t xml:space="preserve">Файл: </w:t>
-      </w:r>
-      <w:r>
-        <w:rPr>
-          <w:rFonts w:ascii="Consolas" w:hAnsi="Consolas"/>
-        </w:rPr>
-        <w:t>Textures/Things/Building/Production/PatternLoom.png</w:t>
-      </w:r>
-      <w:r>
-        <w:t xml:space="preserve"> (новый файл)</w:t>
+        <w:t>Файл: `Textures/Things/Building/Production/PatternLoom.png` (новый файл)</w:t>
       </w:r>
     </w:p>
     <w:p>
@@ -137,13 +119,7 @@
     </w:p>
     <w:p>
       <w:r>
-        <w:t xml:space="preserve">Файл: </w:t>
-      </w:r>
-      <w:r>
-        <w:rPr>
-          <w:rFonts w:ascii="Consolas" w:hAnsi="Consolas"/>
-        </w:rPr>
-        <w:t>Textures/Things/Building/Production/MatterEnergyConverter.png</w:t>
+        <w:t>Файл: `Textures/Things/Building/Production/MatterEnergyConverter.png`</w:t>
       </w:r>
     </w:p>
     <w:p>
@@ -164,16 +140,7 @@
     </w:p>
     <w:p>
       <w:r>
-        <w:t xml:space="preserve">Файл: </w:t>
-      </w:r>
-      <w:r>
-        <w:rPr>
-          <w:rFonts w:ascii="Consolas" w:hAnsi="Consolas"/>
-        </w:rPr>
-        <w:t>Textures/Things/Building/Production/RealityWeaver.png</w:t>
-      </w:r>
-      <w:r>
-        <w:t xml:space="preserve"> (та же текстура у авийского столпа — после арта разведу)</w:t>
+        <w:t>Файл: `Textures/Things/Building/Production/RealityWeaver.png` (та же текстура у авийского столпа — после арта разведу)</w:t>
       </w:r>
     </w:p>
     <w:p>
@@ -194,13 +161,7 @@
     </w:p>
     <w:p>
       <w:r>
-        <w:t xml:space="preserve">Файл: </w:t>
-      </w:r>
-      <w:r>
-        <w:rPr>
-          <w:rFonts w:ascii="Consolas" w:hAnsi="Consolas"/>
-        </w:rPr>
-        <w:t>Textures/Things/Building/Production/GlobalFireExtinguisher.png</w:t>
+        <w:t>Файл: `Textures/Things/Building/Production/GlobalFireExtinguisher.png`</w:t>
       </w:r>
     </w:p>
     <w:p>
@@ -221,13 +182,7 @@
     </w:p>
     <w:p>
       <w:r>
-        <w:t xml:space="preserve">Файл: </w:t>
-      </w:r>
-      <w:r>
-        <w:rPr>
-          <w:rFonts w:ascii="Consolas" w:hAnsi="Consolas"/>
-        </w:rPr>
-        <w:t>Textures/Things/Building/Production/OmniBattery.png</w:t>
+        <w:t>Файл: `Textures/Things/Building/Production/OmniBattery.png`</w:t>
       </w:r>
     </w:p>
     <w:p>
@@ -248,16 +203,7 @@
     </w:p>
     <w:p>
       <w:r>
-        <w:t xml:space="preserve">Файл: </w:t>
-      </w:r>
-      <w:r>
-        <w:rPr>
-          <w:rFonts w:ascii="Consolas" w:hAnsi="Consolas"/>
-        </w:rPr>
-        <w:t>Textures/Things/Building/Production/AvirPylon.png</w:t>
-      </w:r>
-      <w:r>
-        <w:t xml:space="preserve"> (новый файл)</w:t>
+        <w:t>Файл: `Textures/Things/Building/Production/AvirPylon.png` (новый файл)</w:t>
       </w:r>
     </w:p>
     <w:p>
@@ -278,13 +224,7 @@
     </w:p>
     <w:p>
       <w:r>
-        <w:t xml:space="preserve">Файл: </w:t>
-      </w:r>
-      <w:r>
-        <w:rPr>
-          <w:rFonts w:ascii="Consolas" w:hAnsi="Consolas"/>
-        </w:rPr>
-        <w:t>Textures/Things/Building/Production/Avir_FeignalliteCore.png</w:t>
+        <w:t>Файл: `Textures/Things/Building/Production/Avir_FeignalliteCore.png`</w:t>
       </w:r>
     </w:p>
     <w:p>
@@ -305,31 +245,7 @@
     </w:p>
     <w:p>
       <w:r>
-        <w:t xml:space="preserve">Файлы: </w:t>
-      </w:r>
-      <w:r>
-        <w:rPr>
-          <w:rFonts w:ascii="Consolas" w:hAnsi="Consolas"/>
-        </w:rPr>
-        <w:t>Textures/Things/Building/AvirFermentingBarrel/Avir_FermentingBarrel_south.png</w:t>
-      </w:r>
-      <w:r>
-        <w:t xml:space="preserve">, </w:t>
-      </w:r>
-      <w:r>
-        <w:rPr>
-          <w:rFonts w:ascii="Consolas" w:hAnsi="Consolas"/>
-        </w:rPr>
-        <w:t>_east.png</w:t>
-      </w:r>
-      <w:r>
-        <w:t xml:space="preserve">, </w:t>
-      </w:r>
-      <w:r>
-        <w:rPr>
-          <w:rFonts w:ascii="Consolas" w:hAnsi="Consolas"/>
-        </w:rPr>
-        <w:t>_north.png</w:t>
+        <w:t>Файлы: `Textures/Things/Building/AvirFermentingBarrel/Avir_FermentingBarrel_south.png`, `_east.png`, `_north.png`</w:t>
       </w:r>
     </w:p>
     <w:p>
@@ -363,34 +279,7 @@
     </w:p>
     <w:p>
       <w:r>
-        <w:t xml:space="preserve">Файлы: </w:t>
-      </w:r>
-      <w:r>
-        <w:rPr>
-          <w:rFonts w:ascii="Consolas" w:hAnsi="Consolas"/>
-        </w:rPr>
-        <w:t>Textures/Terrain/Surfaces/Avir_ColdSoil.png</w:t>
-      </w:r>
-      <w:r>
-        <w:t xml:space="preserve">, </w:t>
-      </w:r>
-      <w:r>
-        <w:rPr>
-          <w:rFonts w:ascii="Consolas" w:hAnsi="Consolas"/>
-        </w:rPr>
-        <w:t>Avir_ColdSoil_B.png</w:t>
-      </w:r>
-      <w:r>
-        <w:t xml:space="preserve">, </w:t>
-      </w:r>
-      <w:r>
-        <w:rPr>
-          <w:rFonts w:ascii="Consolas" w:hAnsi="Consolas"/>
-        </w:rPr>
-        <w:t>Avir_ColdSoil_C.png</w:t>
-      </w:r>
-      <w:r>
-        <w:t xml:space="preserve"> (без каймы). Игра кладёт их пятнами вперемешку. Нынешняя повторяется на глазах из-за крупных заметных деталей (камни, звёзды инея) — у земли их быть не должно: только мелкое ровное зерно, как у ванильной почвы. Каждый вариант — отдельная картинка, отдельным запросом.</w:t>
+        <w:t>Файлы: `Textures/Terrain/Surfaces/Avir_ColdSoil.png`, `Avir_ColdSoil_B.png`, `Avir_ColdSoil_C.png` (без каймы). Игра кладёт их пятнами вперемешку. Нынешняя повторяется на глазах из-за крупных заметных деталей (камни, звёзды инея) — у земли их быть не должно: только мелкое ровное зерно, как у ванильной почвы. Каждый вариант — отдельная картинка, отдельным запросом.</w:t>
       </w:r>
     </w:p>
     <w:p>
@@ -416,16 +305,7 @@
     </w:p>
     <w:p>
       <w:r>
-        <w:t xml:space="preserve">Файл: </w:t>
-      </w:r>
-      <w:r>
-        <w:rPr>
-          <w:rFonts w:ascii="Consolas" w:hAnsi="Consolas"/>
-        </w:rPr>
-        <w:t>Textures/Terrain/Surfaces/Avir_ImbuedFrostSoil.png</w:t>
-      </w:r>
-      <w:r>
-        <w:t xml:space="preserve"> (без каймы)</w:t>
+        <w:t>Файл: `Textures/Terrain/Surfaces/Avir_ImbuedFrostSoil.png` (без каймы)</w:t>
       </w:r>
     </w:p>
     <w:p>
@@ -467,16 +347,7 @@
     </w:p>
     <w:p>
       <w:r>
-        <w:t xml:space="preserve">Файл: </w:t>
-      </w:r>
-      <w:r>
-        <w:rPr>
-          <w:rFonts w:ascii="Consolas" w:hAnsi="Consolas"/>
-        </w:rPr>
-        <w:t>Textures/UI/Ritualistics/ArliePlaque.png</w:t>
-      </w:r>
-      <w:r>
-        <w:t xml:space="preserve"> — рисуется растянутой под текст; левая пятая часть занята эмблемой, текст (светлый) пишется правее.</w:t>
+        <w:t>Файл: `Textures/UI/Ritualistics/ArliePlaque.png` — рисуется растянутой под текст; левая пятая часть занята эмблемой, текст (светлый) пишется правее.</w:t>
       </w:r>
     </w:p>
     <w:p>
@@ -515,16 +386,7 @@
     </w:p>
     <w:p>
       <w:r>
-        <w:t xml:space="preserve">Файл: </w:t>
-      </w:r>
-      <w:r>
-        <w:rPr>
-          <w:rFonts w:ascii="Consolas" w:hAnsi="Consolas"/>
-        </w:rPr>
-        <w:t>Textures/UI/Ritualistics/SuccessPlaque.png</w:t>
-      </w:r>
-      <w:r>
-        <w:t xml:space="preserve"> — растягивается по ширине колонки, надпись «Success chance — N%» по центру.</w:t>
+        <w:t>Файл: `Textures/UI/Ritualistics/SuccessPlaque.png` — растягивается по ширине колонки, надпись «Success chance — N%» по центру.</w:t>
       </w:r>
     </w:p>
     <w:p>
@@ -566,16 +428,7 @@
     </w:p>
     <w:p>
       <w:r>
-        <w:t xml:space="preserve">Файл: </w:t>
-      </w:r>
-      <w:r>
-        <w:rPr>
-          <w:rFonts w:ascii="Consolas" w:hAnsi="Consolas"/>
-        </w:rPr>
-        <w:t>Textures/UI/Ritualistics/Panel.png</w:t>
-      </w:r>
-      <w:r>
-        <w:t>, 1024×1024. Режется на девять частей: углы — по четверти картинки с каждой стороны, в игре рисуются примерно 56 пикселей; края между углами растягиваются, середина тоже. Стоит за каждой из трёх колонок (список слева, круг в центре, страница справа) и за обеими колонками кодекса.</w:t>
+        <w:t>Файл: `Textures/UI/Ritualistics/Panel.png`, 1024×1024. Режется на девять частей: углы — по четверти картинки с каждой стороны, в игре рисуются примерно 56 пикселей; края между углами растягиваются, середина тоже. Стоит за каждой из трёх колонок (список слева, круг в центре, страница справа) и за обеими колонками кодекса.</w:t>
       </w:r>
     </w:p>
     <w:p>
@@ -596,16 +449,7 @@
     </w:p>
     <w:p>
       <w:r>
-        <w:t xml:space="preserve">Файл: </w:t>
-      </w:r>
-      <w:r>
-        <w:rPr>
-          <w:rFonts w:ascii="Consolas" w:hAnsi="Consolas"/>
-        </w:rPr>
-        <w:t>Textures/UI/Ritualistics/Card.png</w:t>
-      </w:r>
-      <w:r>
-        <w:t>, 512×512. Девять частей: углы — пятая часть картинки, в игре около 22 пикселей. Под каждым блоком текста на правой странице: «что делает» и «DETAILS» — каждый на своей карточке.</w:t>
+        <w:t>Файл: `Textures/UI/Ritualistics/Card.png`, 512×512. Девять частей: углы — пятая часть картинки, в игре около 22 пикселей. Под каждым блоком текста на правой странице: «что делает» и «DETAILS» — каждый на своей карточке.</w:t>
       </w:r>
     </w:p>
     <w:p>
@@ -626,16 +470,7 @@
     </w:p>
     <w:p>
       <w:r>
-        <w:t xml:space="preserve">Файл: </w:t>
-      </w:r>
-      <w:r>
-        <w:rPr>
-          <w:rFonts w:ascii="Consolas" w:hAnsi="Consolas"/>
-        </w:rPr>
-        <w:t>Textures/UI/Ritualistics/RowSelected.png</w:t>
-      </w:r>
-      <w:r>
-        <w:t>, 1024×128. Режется на три части: края — по 15% ширины, середина растягивается. Под выбранным ритуалом в книге и под выбранной руной в кодексе.</w:t>
+        <w:t>Файл: `Textures/UI/Ritualistics/RowSelected.png`, 1024×128. Режется на три части: края — по 15% ширины, середина растягивается. Под выбранным ритуалом в книге и под выбранной руной в кодексе.</w:t>
       </w:r>
     </w:p>
     <w:p>
@@ -656,25 +491,7 @@
     </w:p>
     <w:p>
       <w:r>
-        <w:t xml:space="preserve">Два файла: </w:t>
-      </w:r>
-      <w:r>
-        <w:rPr>
-          <w:rFonts w:ascii="Consolas" w:hAnsi="Consolas"/>
-        </w:rPr>
-        <w:t>Textures/UI/Ritualistics/ScrollTrack.png</w:t>
-      </w:r>
-      <w:r>
-        <w:t xml:space="preserve">, 32×512 (желобок), и </w:t>
-      </w:r>
-      <w:r>
-        <w:rPr>
-          <w:rFonts w:ascii="Consolas" w:hAnsi="Consolas"/>
-        </w:rPr>
-        <w:t>Textures/UI/Ritualistics/ScrollThumb.png</w:t>
-      </w:r>
-      <w:r>
-        <w:t>, 32×256 (ползунок). У обоих концы сохраняют форму, середина растягивается по высоте: у желобка по восьмой части сверху и снизу, у ползунка по четверти. В игре они около 16 пикселей шириной, поэтому рисунок крупный и простой.</w:t>
+        <w:t>Два файла: `Textures/UI/Ritualistics/ScrollTrack.png`, 32×512 (желобок), и `Textures/UI/Ritualistics/ScrollThumb.png`, 32×256 (ползунок). У обоих концы сохраняют форму, середина растягивается по высоте: у желобка по восьмой части сверху и снизу, у ползунка по четверти. В игре они около 16 пикселей шириной, поэтому рисунок крупный и простой.</w:t>
       </w:r>
     </w:p>
     <w:p>
@@ -703,16 +520,7 @@
     </w:p>
     <w:p>
       <w:r>
-        <w:t xml:space="preserve">Файлы: </w:t>
-      </w:r>
-      <w:r>
-        <w:rPr>
-          <w:rFonts w:ascii="Consolas" w:hAnsi="Consolas"/>
-        </w:rPr>
-        <w:t>Textures/UI/Ritualistics/Runes/Ink/Rune_&lt;Имя&gt;.png</w:t>
-      </w:r>
-      <w:r>
-        <w:t>, 512×512, прозрачный фон. Светящийся вариант (Glow) я делаю сама из чернильного. Руны общие для ритуалистики и магии.</w:t>
+        <w:t>Файлы: `Textures/UI/Ritualistics/Runes/Ink/Rune_&lt;Имя&gt;.png`, 512×512, прозрачный фон. Светящийся вариант (Glow) я делаю сама из чернильного. Руны общие для ритуалистики и магии.</w:t>
       </w:r>
     </w:p>
     <w:p>
@@ -736,7 +544,14 @@
         <w:rPr>
           <w:b/>
         </w:rPr>
+      </w:r>
+      <w:r>
         <w:t>Пульс</w:t>
+      </w:r>
+      <w:r>
+        <w:rPr>
+          <w:b/>
+        </w:rPr>
       </w:r>
       <w:r>
         <w:t xml:space="preserve"> = Release, </w:t>
@@ -745,7 +560,14 @@
         <w:rPr>
           <w:b/>
         </w:rPr>
+      </w:r>
+      <w:r>
         <w:t>Оковы</w:t>
+      </w:r>
+      <w:r>
+        <w:rPr>
+          <w:b/>
+        </w:rPr>
       </w:r>
       <w:r>
         <w:t xml:space="preserve"> = Hold, </w:t>
@@ -754,7 +576,14 @@
         <w:rPr>
           <w:b/>
         </w:rPr>
+      </w:r>
+      <w:r>
         <w:t>Иссушение</w:t>
+      </w:r>
+      <w:r>
+        <w:rPr>
+          <w:b/>
+        </w:rPr>
       </w:r>
       <w:r>
         <w:t xml:space="preserve"> = Drain, </w:t>
@@ -763,7 +592,14 @@
         <w:rPr>
           <w:b/>
         </w:rPr>
+      </w:r>
+      <w:r>
         <w:t>Оберег</w:t>
+      </w:r>
+      <w:r>
+        <w:rPr>
+          <w:b/>
+        </w:rPr>
       </w:r>
       <w:r>
         <w:t xml:space="preserve"> = Barrier.</w:t>
@@ -785,7 +621,14 @@
         <w:rPr>
           <w:b/>
         </w:rPr>
+      </w:r>
+      <w:r>
         <w:t>Rune_Fire</w:t>
+      </w:r>
+      <w:r>
+        <w:rPr>
+          <w:b/>
+        </w:rPr>
       </w:r>
       <w:r>
         <w:t xml:space="preserve"> (Огонь): &gt; Rune of fire: three tapered needle strokes rising and curling inward like a single flame tongue, the central stroke tallest, a small diamond node at the base. [приписка]</w:t>
@@ -799,7 +642,14 @@
         <w:rPr>
           <w:b/>
         </w:rPr>
+      </w:r>
+      <w:r>
         <w:t>Rune_Water</w:t>
+      </w:r>
+      <w:r>
+        <w:rPr>
+          <w:b/>
+        </w:rPr>
       </w:r>
       <w:r>
         <w:t xml:space="preserve"> (Вода): &gt; Rune of water: two long tapered strokes bending into a gentle S-wave, a third shorter wave beneath echoing it, a small diamond node like a falling drop above. [приписка]</w:t>
@@ -813,7 +663,14 @@
         <w:rPr>
           <w:b/>
         </w:rPr>
+      </w:r>
+      <w:r>
         <w:t>Rune_Earth</w:t>
+      </w:r>
+      <w:r>
+        <w:rPr>
+          <w:b/>
+        </w:rPr>
       </w:r>
       <w:r>
         <w:t xml:space="preserve"> (Земля): &gt; Rune of earth: a heavy horizontal tapered stroke with two short strokes rising from it like a mountain's slopes meeting at a diamond peak, a short root stroke going down from the middle. [приписка]</w:t>
@@ -827,7 +684,14 @@
         <w:rPr>
           <w:b/>
         </w:rPr>
+      </w:r>
+      <w:r>
         <w:t>Rune_Air</w:t>
+      </w:r>
+      <w:r>
+        <w:rPr>
+          <w:b/>
+        </w:rPr>
       </w:r>
       <w:r>
         <w:t xml:space="preserve"> (Воздух): &gt; Rune of air: three thin tapered strokes sweeping in one direction like gusts, each curling at its end into a small open hook, staggered one above another. [приписка]</w:t>
@@ -841,7 +705,14 @@
         <w:rPr>
           <w:b/>
         </w:rPr>
+      </w:r>
+      <w:r>
         <w:t>Rune_Light</w:t>
+      </w:r>
+      <w:r>
+        <w:rPr>
+          <w:b/>
+        </w:rPr>
       </w:r>
       <w:r>
         <w:t xml:space="preserve"> (Свет): &gt; Rune of light: a vertical needle stroke crossed by a shorter horizontal one, with four tiny strokes radiating diagonally from a diamond centre, like a four-point star with faint rays. [приписка]</w:t>
@@ -855,7 +726,14 @@
         <w:rPr>
           <w:b/>
         </w:rPr>
+      </w:r>
+      <w:r>
         <w:t>Rune_Time</w:t>
+      </w:r>
+      <w:r>
+        <w:rPr>
+          <w:b/>
+        </w:rPr>
       </w:r>
       <w:r>
         <w:t xml:space="preserve"> (Время): &gt; Rune of time: two tapered strokes forming an hourglass - two triangles meeting at a diamond node in the middle, a thin arc stroke curving around one side like the edge of a turning wheel. [приписка]</w:t>
@@ -869,7 +747,14 @@
         <w:rPr>
           <w:b/>
         </w:rPr>
+      </w:r>
+      <w:r>
         <w:t>Rune_Life</w:t>
+      </w:r>
+      <w:r>
+        <w:rPr>
+          <w:b/>
+        </w:rPr>
       </w:r>
       <w:r>
         <w:t xml:space="preserve"> (Жизнь): &gt; Rune of life: a vertical tapered stroke like a stem, two leaf-shaped strokes opening from it to either side, and a thin stroke flowing from one leaf back to the base, closing a cycle. [приписка]</w:t>
@@ -883,7 +768,14 @@
         <w:rPr>
           <w:b/>
         </w:rPr>
+      </w:r>
+      <w:r>
         <w:t>Rune_Darkness</w:t>
+      </w:r>
+      <w:r>
+        <w:rPr>
+          <w:b/>
+        </w:rPr>
       </w:r>
       <w:r>
         <w:t xml:space="preserve"> (Тьма): &gt; Rune of darkness: a thick crescent stroke curving around an empty centre, its two points nearly touching, a single small diamond node hidden inside the crescent like an eye half-closed. [приписка]</w:t>
@@ -897,7 +789,14 @@
         <w:rPr>
           <w:b/>
         </w:rPr>
+      </w:r>
+      <w:r>
         <w:t>Rune_Space</w:t>
+      </w:r>
+      <w:r>
+        <w:rPr>
+          <w:b/>
+        </w:rPr>
       </w:r>
       <w:r>
         <w:t xml:space="preserve"> (Пространство, малая школа телекинеза): &gt; Rune of space: a diamond node in the centre with four thin tapered strokes reaching out to four smaller diamond nodes, as if pulled by invisible threads, one thread slightly bent. [приписка]</w:t>
@@ -919,7 +818,14 @@
         <w:rPr>
           <w:b/>
         </w:rPr>
+      </w:r>
+      <w:r>
         <w:t>Rune_Aura</w:t>
+      </w:r>
+      <w:r>
+        <w:rPr>
+          <w:b/>
+        </w:rPr>
       </w:r>
       <w:r>
         <w:t xml:space="preserve"> (Аура): &gt; Rune of aura: a small diamond node at the centre inside two broken concentric arcs of tapered strokes, the gaps of the arcs offset from each other. [приписка]</w:t>
@@ -933,7 +839,14 @@
         <w:rPr>
           <w:b/>
         </w:rPr>
+      </w:r>
+      <w:r>
         <w:t>Rune_Enchant</w:t>
+      </w:r>
+      <w:r>
+        <w:rPr>
+          <w:b/>
+        </w:rPr>
       </w:r>
       <w:r>
         <w:t xml:space="preserve"> (Наделение): &gt; Rune of enchanting: a tapered blade-like vertical stroke with a short crossguard stroke, and a thin spiral stroke winding once around the blade from hilt to point. [приписка]</w:t>
@@ -947,7 +860,14 @@
         <w:rPr>
           <w:b/>
         </w:rPr>
+      </w:r>
+      <w:r>
         <w:t>Rune_Step</w:t>
+      </w:r>
+      <w:r>
+        <w:rPr>
+          <w:b/>
+        </w:rPr>
       </w:r>
       <w:r>
         <w:t xml:space="preserve"> (Шаг): &gt; Rune of stepping: two diamond nodes far apart joined by a single long tapered stroke that arcs between them like a leap, with a small chevron stroke at the landing end. [приписка]</w:t>
@@ -961,7 +881,14 @@
         <w:rPr>
           <w:b/>
         </w:rPr>
+      </w:r>
+      <w:r>
         <w:t>Rune_Restore</w:t>
+      </w:r>
+      <w:r>
+        <w:rPr>
+          <w:b/>
+        </w:rPr>
       </w:r>
       <w:r>
         <w:t xml:space="preserve"> (Восстановление): &gt; Rune of restoring: a nearly closed circular tapered stroke with its ends overlapping, a short stroke inside pointing back against the direction of the circle, like time turned back on a wound. [приписка]</w:t>
@@ -975,7 +902,14 @@
         <w:rPr>
           <w:b/>
         </w:rPr>
+      </w:r>
+      <w:r>
         <w:t>Rune_Beam</w:t>
+      </w:r>
+      <w:r>
+        <w:rPr>
+          <w:b/>
+        </w:rPr>
       </w:r>
       <w:r>
         <w:t xml:space="preserve"> (Луч): &gt; Rune of a beam: one long straight horizontal needle stroke issuing from a diamond node at the left, two thin parallel strokes running alongside it and fading out before its point. [приписка]</w:t>
@@ -989,7 +923,14 @@
         <w:rPr>
           <w:b/>
         </w:rPr>
+      </w:r>
+      <w:r>
         <w:t>Rune_Shape</w:t>
+      </w:r>
+      <w:r>
+        <w:rPr>
+          <w:b/>
+        </w:rPr>
       </w:r>
       <w:r>
         <w:t xml:space="preserve"> (Ваяние): &gt; Rune of shaping: a square of four tapered strokes with one corner pulled out and bent into a curve, as if the form is being reshaped, a diamond node at the bent corner. [приписка]</w:t>
@@ -1003,7 +944,14 @@
         <w:rPr>
           <w:b/>
         </w:rPr>
+      </w:r>
+      <w:r>
         <w:t>Rune_Summon</w:t>
+      </w:r>
+      <w:r>
+        <w:rPr>
+          <w:b/>
+        </w:rPr>
       </w:r>
       <w:r>
         <w:t xml:space="preserve"> (Призыв): &gt; Rune of summoning: an open downward arch of tapered strokes like a doorway, a diamond node rising from below through its opening, three tiny strokes above it like a calling. [приписка]</w:t>
@@ -1017,7 +965,14 @@
         <w:rPr>
           <w:b/>
         </w:rPr>
+      </w:r>
+      <w:r>
         <w:t>Rune_Sense</w:t>
+      </w:r>
+      <w:r>
+        <w:rPr>
+          <w:b/>
+        </w:rPr>
       </w:r>
       <w:r>
         <w:t xml:space="preserve"> (Чутьё): &gt; Rune of sensing: an almond eye shape of two tapered curved strokes, its pupil a diamond node, with three short strokes spreading forward from the eye like a seeing gaze. [приписка]</w:t>
@@ -1033,16 +988,7 @@
     </w:p>
     <w:p>
       <w:r>
-        <w:t xml:space="preserve">Референс: </w:t>
-      </w:r>
-      <w:r>
-        <w:rPr>
-          <w:rFonts w:ascii="Consolas" w:hAnsi="Consolas"/>
-        </w:rPr>
-        <w:t>docs/Руны-референс.png</w:t>
-      </w:r>
-      <w:r>
-        <w:t xml:space="preserve"> (12 нынешних рун). Приложить его к запросу. Потом я сама разрежу лист на отдельные руны.</w:t>
+        <w:t>Референс: `docs/Руны-референс.png` (12 нынешних рун). Приложить его к запросу. Потом я сама разрежу лист на отдельные руны.</w:t>
       </w:r>
     </w:p>
     <w:p>
@@ -1264,34 +1210,23 @@
     </w:p>
     <w:p>
       <w:r>
-        <w:t xml:space="preserve">Файлы: </w:t>
-      </w:r>
-      <w:r>
-        <w:rPr>
-          <w:rFonts w:ascii="Consolas" w:hAnsi="Consolas"/>
-        </w:rPr>
-        <w:t>Textures/UI/Magic/ArcanaMage.png</w:t>
-      </w:r>
-      <w:r>
-        <w:t xml:space="preserve"> и </w:t>
-      </w:r>
-      <w:r>
-        <w:rPr>
-          <w:rFonts w:ascii="Consolas" w:hAnsi="Consolas"/>
-        </w:rPr>
-        <w:t>Textures/UI/Magic/ArcanaSorcerer.png</w:t>
-      </w:r>
-      <w:r>
-        <w:t xml:space="preserve">, по 1024×362 (пропорция 136×48). Это рамка с </w:t>
+        <w:t xml:space="preserve">Файлы: `Textures/UI/Magic/ArcanaMage.png` и `Textures/UI/Magic/ArcanaSorcerer.png`, по 1024×427 (пропорция кнопки 180×75). Рамка с </w:t>
       </w:r>
       <w:r>
         <w:rPr>
           <w:b/>
         </w:rPr>
+      </w:r>
+      <w:r>
         <w:t>прозрачным окном</w:t>
       </w:r>
       <w:r>
-        <w:t xml:space="preserve"> под полосу: окно — от 12% до 88% по ширине и от 46% до 82% по высоте. Полосу, метки и число рисует игра, в верхней части рамки над окном пишется число.</w:t>
+        <w:rPr>
+          <w:b/>
+        </w:rPr>
+      </w:r>
+      <w:r>
+        <w:t xml:space="preserve"> под полосу: окно — от 12% до 88% по ширине и от 52% до 82% по высоте. Над окном игра пишет «Mage/Sorcerer  50 / 100».</w:t>
       </w:r>
     </w:p>
     <w:p>
@@ -1299,7 +1234,7 @@
         <w:pStyle w:val="IntenseQuote"/>
       </w:pPr>
       <w:r>
-        <w:t>Two small horizontal gauge plaques for a game interface, side by side on one sheet, flat front view, transparent background, each 1024×362: a frame of dark worked silver with a long narrow window cut through its lower half - the window fully transparent, spanning from 12% to 88% of the width and from 46% to 82% of the height, its edges clean and straight; above the window a quiet strip of dark lacquer for a small number. Left plaque, the mage's: cold steel-blue enamel inlays along the frame, a small sapphire set at each end of the window, thin lines like the ruled margins of a spellbook. Right plaque, the sorcerer's: warm antique gold, the frame grown with fine flame-like filigree as if it were born that way, a small amber stone at each end of the window. Both: Avir-adjacent ritualist style - worked metal, small four-point stars, a crescent at most; clean game UI art, a thin dark outline, no text, no letters, no numbers.</w:t>
+        <w:t>Two gauge plaques for a game interface, side by side on one sheet, flat front view, transparent background, each 1024×427: a frame of dark worked silver with a long narrow window cut through its lower half - the window fully transparent, spanning from 12% to 88% of the width and from 52% to 82% of the height, its edges clean and straight; above the window a calm strip of dark lacquer, left plain for a line of text. Left plaque, the mage's: cold steel-blue enamel inlays along the frame, a small sapphire at each end of the window, thin ruled lines like the margins of a spellbook. Right plaque, the sorcerer's: warm antique gold, the frame grown with fine flame-like filigree as if it were born that way, a small amber stone at each end of the window. Both: worked metal, small four-point stars, a crescent at most; clean game UI art, a thin dark outline, no text, no letters, no numbers.</w:t>
       </w:r>
     </w:p>
     <w:p>
@@ -1320,39 +1255,12 @@
         <w:pStyle w:val="Heading3"/>
       </w:pPr>
       <w:r>
-        <w:t>Платформа, три ракурса (одним листом)</w:t>
+        <w:t>Платформа (одна текстура, круговая)</w:t>
       </w:r>
     </w:p>
     <w:p>
       <w:r>
-        <w:t xml:space="preserve">Файлы: </w:t>
-      </w:r>
-      <w:r>
-        <w:rPr>
-          <w:rFonts w:ascii="Consolas" w:hAnsi="Consolas"/>
-        </w:rPr>
-        <w:t>Textures/Things/Building/Magic/Sanctuary_north.png</w:t>
-      </w:r>
-      <w:r>
-        <w:t xml:space="preserve">, </w:t>
-      </w:r>
-      <w:r>
-        <w:rPr>
-          <w:rFonts w:ascii="Consolas" w:hAnsi="Consolas"/>
-        </w:rPr>
-        <w:t>_east.png</w:t>
-      </w:r>
-      <w:r>
-        <w:t xml:space="preserve">, </w:t>
-      </w:r>
-      <w:r>
-        <w:rPr>
-          <w:rFonts w:ascii="Consolas" w:hAnsi="Consolas"/>
-        </w:rPr>
-        <w:t>_south.png</w:t>
-      </w:r>
-      <w:r>
-        <w:t>, каждый 1024×1024.</w:t>
+        <w:t>Файл: `Textures/Things/Building/Magic/Sanctuary.png`, 1024×1024. Одна картинка на все повороты: у неё нет «передней стороны».</w:t>
       </w:r>
     </w:p>
     <w:p>
@@ -1360,7 +1268,7 @@
         <w:pStyle w:val="IntenseQuote"/>
       </w:pPr>
       <w:r>
-        <w:t>A game asset sheet showing the same building from three views side by side - north, east and south - each on its own transparent square, RimWorld top-down art style (viewed from above at a slight angle, crisp painted shapes, a thin dark outline): a round sanctuary platform of old grey carved stone set flush into the ground, five cells wide; a broad flat ring of worn flagstones with a low raised rim, the rim carved with a band of small four-point stars, crescents and short feather strokes; three thin concentric grooves cut into the floor like the rings of a ritual circle, left empty and clean so a ritual can be drawn into them; at the centre a smooth round stone dais with an empty round socket where a rune will be laid; four small standing stones at the cardinal points of the rim, each with a hollow for a crystal. Plain grey stone only - no colour, no glow, no paint, no runes, no text; the floor between the grooves calm and empty. Each view centred and filling its square.</w:t>
+        <w:t>A single top-down game sprite of a round stone sanctuary, RimWorld art style, seen straight from above, on a transparent background, filling the square: perfectly radially symmetrical with eight-fold symmetry, so that it looks the same however it is rotated - no front, no back, no side features, no standing stones or pillars, no light source direction (soft even ambient shading only). A low circular platform of old pale-grey carved stone set into the ground: an outer rim of eight curved stone segments with a thin carved band of alternating four-point stars and short feather strokes; inside it a wide calm floor of large curved flagstones with faint natural cracks; three thin, evenly spaced concentric grooves cut into the floor, clean and empty, ready for a ritual to be drawn in them; eight small round shallow cups set evenly into the rim for crystals; at the centre a slightly raised round dais with an empty smooth round socket. Plain unpainted stone only - no colour, no glow, no moss, no runes, no text. Crisp painted shapes, a thin dark outline. 1024×1024.</w:t>
       </w:r>
     </w:p>
     <w:p>
@@ -1373,16 +1281,7 @@
     </w:p>
     <w:p>
       <w:r>
-        <w:t xml:space="preserve">Файл: </w:t>
-      </w:r>
-      <w:r>
-        <w:rPr>
-          <w:rFonts w:ascii="Consolas" w:hAnsi="Consolas"/>
-        </w:rPr>
-        <w:t>Textures/Things/Building/Magic/SanctuaryFlow.png</w:t>
-      </w:r>
-      <w:r>
-        <w:t>, 1024×1024. Игра вращает его, пульсирует яркостью и окрашивает в цвет элемента.</w:t>
+        <w:t>Файл: `Textures/Things/Building/Magic/SanctuaryFlow.png`, 1024×1024. Игра вращает его, пульсирует яркостью и окрашивает в цвет элемента.</w:t>
       </w:r>
     </w:p>
     <w:p>

</xml_diff>